<commit_message>
v2.1: filtre Actiu (col. E), codi B=Baixa i marge de reincorporació de 3 dies
- load_input llegeix Radiòlegs!E i exclou els NO actius de la roda,
  dels nou-incorporats i dels perfils especials; els torns fixos
  d'un inactiu es marquen [SUBSTITUIR]
- nou codi B (Baixa) a la pestanya Vacances, idèntic a V
- DIES_REINCORPORACIO=3: després d'una absència V/B es bloquegen
  2 dies més; el professional no perd el torn
- validació, UI Streamlit, plantilles Excel i documentació al dia
- .gitignore: bloqueja plantilles i plannings amb dades reals
</commit_message>
<xml_diff>
--- a/01_Regles_Procés.docx
+++ b/01_Regles_Procés.docx
@@ -46,7 +46,7 @@
         <w:pStyle w:val="ListBullet"/>
       </w:pPr>
       <w:r>
-        <w:t>"Radiòlegs": llista mestra de tots els professionals amb el seu rol assignat.</w:t>
+        <w:t>"Radiòlegs": llista mestra de tots els professionals amb el seu rol assignat (columna B) i si fan guàrdies aquest mes (columna E, "Actiu aquest mes").</w:t>
       </w:r>
     </w:p>
     <w:p>
@@ -54,7 +54,7 @@
         <w:pStyle w:val="ListBullet"/>
       </w:pPr>
       <w:r>
-        <w:t>"Vacances": per a cada professional i dia del mes, codi V/C/G/X si aplica.</w:t>
+        <w:t>"Vacances": per a cada professional i dia del mes, codi V/B/C/G/X si aplica.</w:t>
       </w:r>
     </w:p>
     <w:p>
@@ -114,7 +114,29 @@
           </w:tcPr>
           <w:p>
             <w:r>
-              <w:t>Vacances. No es pot assignar guàrdia aquell dia.</w:t>
+              <w:t>Vacances. No es pot assignar guàrdia aquell dia. En acabar l'absència, el professional té 2 dies més de marge de reincorporació.</w:t>
+            </w:r>
+          </w:p>
+        </w:tc>
+      </w:tr>
+      <w:tr>
+        <w:tc>
+          <w:tcPr>
+            <w:tcW w:type="dxa" w:w="4320"/>
+          </w:tcPr>
+          <w:p>
+            <w:r>
+              <w:t>B</w:t>
+            </w:r>
+          </w:p>
+        </w:tc>
+        <w:tc>
+          <w:tcPr>
+            <w:tcW w:type="dxa" w:w="4320"/>
+          </w:tcPr>
+          <w:p>
+            <w:r>
+              <w:t>Baixa. Comportament idèntic al codi V: bloqueja el dia i afegeix 2 dies de marge de reincorporació.</w:t>
             </w:r>
           </w:p>
         </w:tc>
@@ -136,7 +158,7 @@
           </w:tcPr>
           <w:p>
             <w:r>
-              <w:t>Congrés. No es pot assignar guàrdia aquell dia.</w:t>
+              <w:t>Congrés. No es pot assignar guàrdia aquell dia. No genera marge de reincorporació.</w:t>
             </w:r>
           </w:p>
         </w:tc>
@@ -1284,6 +1306,83 @@
         <w:t>Durada del període "nou-incorporat" — quant dura, típicament? Qui decideix quan es promou a "rotador"? Documentar el criteri.</w:t>
       </w:r>
     </w:p>
+    <w:p>
+      <w:pPr>
+        <w:pStyle w:val="Heading1"/>
+      </w:pPr>
+      <w:r>
+        <w:t xml:space="preserve">Annex — Actualitzacions v2.1</w:t>
+      </w:r>
+    </w:p>
+    <w:p>
+      <w:pPr>
+        <w:pStyle w:val="Heading2"/>
+      </w:pPr>
+      <w:r>
+        <w:t xml:space="preserve">A. Columna E "Actiu aquest mes" (pestanya Radiòlegs)</w:t>
+      </w:r>
+    </w:p>
+    <w:p>
+      <w:r>
+        <w:t xml:space="preserve">Serveix per treure un professional del planning NOMÉS durant el mes en curs, sense haver d'esborrar ni tornar a afegir la seva fila a la llista mestra.</w:t>
+      </w:r>
+    </w:p>
+    <w:p>
+      <w:r>
+        <w:t xml:space="preserve">• "Sí" o cel·la buida: el professional participa normalment.</w:t>
+      </w:r>
+    </w:p>
+    <w:p>
+      <w:r>
+        <w:t xml:space="preserve">• "No": queda exclòs de la roda, del grup de nou-incorporats i dels perfils especials (sun-nit-only, weekend-day-only). Si té un torn fix assignat a la pestanya Configuració, el planning hi escriurà [SUBSTITUIR — Nom: NO actiu aquest mes], de manera que la tècnica sap que ha de cobrir aquell forat manualment.</w:t>
+      </w:r>
+    </w:p>
+    <w:p>
+      <w:r>
+        <w:t xml:space="preserve">El mes següent n'hi ha prou amb tornar a posar "Sí". La llista mestra de professionals no s'ha de tocar mai per aquest motiu.</w:t>
+      </w:r>
+    </w:p>
+    <w:p>
+      <w:pPr>
+        <w:pStyle w:val="Heading2"/>
+      </w:pPr>
+      <w:r>
+        <w:t xml:space="preserve">B. Codi B = Baixa</w:t>
+      </w:r>
+    </w:p>
+    <w:p>
+      <w:r>
+        <w:t xml:space="preserve">S'afegeix el codi B a la pestanya Vacances, amb un comportament idèntic al codi V: bloqueja el dia i genera marge de reincorporació. Es fa servir per a baixes laborals, permisos i qualsevol absència perllongada que no siguin vacances.</w:t>
+      </w:r>
+    </w:p>
+    <w:p>
+      <w:pPr>
+        <w:pStyle w:val="Heading2"/>
+      </w:pPr>
+      <w:r>
+        <w:t xml:space="preserve">C. Marge de reincorporació de 3 dies</w:t>
+      </w:r>
+    </w:p>
+    <w:p>
+      <w:r>
+        <w:t xml:space="preserve">Fins ara, un professional absent durant la roda hi tornava a entrar l'endemà mateix de la darrera jornada d'absència. A partir d'aquesta versió, quan una absència V o B acaba el dia D, el professional torna a estar disponible el dia D+3: es bloquegen els dies D+1 i D+2 per donar-li temps de reincorporar-se.</w:t>
+      </w:r>
+    </w:p>
+    <w:p>
+      <w:r>
+        <w:t xml:space="preserve">El professional NO perd el torn. Igual que abans, es manté al davant de la cua fins que estigui disponible, de manera que la rotació segueix sent equitativa.</w:t>
+      </w:r>
+    </w:p>
+    <w:p>
+      <w:r>
+        <w:t xml:space="preserve">Els codis C (congrés) i G (guàrdia externa) no generen marge: C bloqueja només el dia i G ja bloqueja el dia anterior i el posterior.</w:t>
+      </w:r>
+    </w:p>
+    <w:p>
+      <w:r>
+        <w:t xml:space="preserve">El nombre de dies és un únic paràmetre configurable al codi (DIES_REINCORPORACIO a app/planning_generator.py). El valor 1 restaura el comportament anterior.</w:t>
+      </w:r>
+    </w:p>
     <w:sectPr>
       <w:pgSz w:w="12240" w:h="15840"/>
       <w:pgMar w:top="1440" w:right="1800" w:bottom="1440" w:left="1800" w:header="720" w:footer="720" w:gutter="0"/>

</xml_diff>